<commit_message>
Aggiunto discorso e aggiustato
</commit_message>
<xml_diff>
--- a/Discorso.docx
+++ b/Discorso.docx
@@ -3,577 +3,171 @@
 <w:document xmlns:wpc="http://schemas.microsoft.com/office/word/2010/wordprocessingCanvas" xmlns:cx="http://schemas.microsoft.com/office/drawing/2014/chartex" xmlns:cx1="http://schemas.microsoft.com/office/drawing/2015/9/8/chartex" xmlns:cx2="http://schemas.microsoft.com/office/drawing/2015/10/21/chartex" xmlns:cx3="http://schemas.microsoft.com/office/drawing/2016/5/9/chartex" xmlns:cx4="http://schemas.microsoft.com/office/drawing/2016/5/10/chartex" xmlns:cx5="http://schemas.microsoft.com/office/drawing/2016/5/11/chartex" xmlns:cx6="http://schemas.microsoft.com/office/drawing/2016/5/12/chartex" xmlns:cx7="http://schemas.microsoft.com/office/drawing/2016/5/13/chartex" xmlns:cx8="http://schemas.microsoft.com/office/drawing/2016/5/14/chartex" xmlns:mc="http://schemas.openxmlformats.org/markup-compatibility/2006" xmlns:aink="http://schemas.microsoft.com/office/drawing/2016/ink" xmlns:am3d="http://schemas.microsoft.com/office/drawing/2017/model3d" xmlns:o="urn:schemas-microsoft-com:office:office" xmlns:oel="http://schemas.microsoft.com/office/2019/extlst" xmlns:r="http://schemas.openxmlformats.org/officeDocument/2006/relationships" xmlns:m="http://schemas.openxmlformats.org/officeDocument/2006/math" xmlns:v="urn:schemas-microsoft-com:vml" xmlns:wp14="http://schemas.microsoft.com/office/word/2010/wordprocessingDrawing" xmlns:wp="http://schemas.openxmlformats.org/drawingml/2006/wordprocessingDrawing" xmlns:w10="urn:schemas-microsoft-com:office:word" xmlns:w="http://schemas.openxmlformats.org/wordprocessingml/2006/main" xmlns:w14="http://schemas.microsoft.com/office/word/2010/wordml" xmlns:w15="http://schemas.microsoft.com/office/word/2012/wordml" xmlns:w16cex="http://schemas.microsoft.com/office/word/2018/wordml/cex" xmlns:w16cid="http://schemas.microsoft.com/office/word/2016/wordml/cid" xmlns:w16="http://schemas.microsoft.com/office/word/2018/wordml" xmlns:w16sdtdh="http://schemas.microsoft.com/office/word/2020/wordml/sdtdatahash" xmlns:w16se="http://schemas.microsoft.com/office/word/2015/wordml/symex" xmlns:wpg="http://schemas.microsoft.com/office/word/2010/wordprocessingGroup" xmlns:wpi="http://schemas.microsoft.com/office/word/2010/wordprocessingInk" xmlns:wne="http://schemas.microsoft.com/office/word/2006/wordml" xmlns:wps="http://schemas.microsoft.com/office/word/2010/wordprocessingShape" mc:Ignorable="w14 w15 w16se w16cid w16 w16cex w16sdtdh wp14">
   <w:body>
     <w:p>
-      <w:pPr>
+      <w:r>
         <w:rPr>
           <w:b/>
           <w:bCs/>
         </w:rPr>
-      </w:pPr>
-      <w:r>
-        <w:rPr>
-          <w:rFonts w:ascii="Segoe UI Emoji" w:hAnsi="Segoe UI Emoji" w:cs="Segoe UI Emoji"/>
-          <w:b/>
-          <w:bCs/>
-        </w:rPr>
-        <w:t>🎤</w:t>
+        <w:t>VERSIONE BREVE:</w:t>
+      </w:r>
+      <w:r>
+        <w:br/>
+      </w:r>
+      <w:r>
+        <w:t>In questo discorso presento un progetto di marketing territoriale realizzato con la mia classe per valorizzare i borghi della Locride attraverso un sito web. L’obiettivo è raccontare il territorio in modo coinvolgente, unendo storytelling, comunicazione visiva e strumenti digitali.</w:t>
+      </w:r>
+    </w:p>
+    <w:p/>
+    <w:p>
+      <w:r>
+        <w:t>Mi sono occupato della parte tecnica, sviluppando il sito da zero con HTML e CSS, curando il design, la mappa interattiva e l’ottimizzazione delle immagini. Prima della realizzazione, abbiamo svolto un’attenta ricerca per garantire contenuti accurati e affidabili.</w:t>
+      </w:r>
+    </w:p>
+    <w:p/>
+    <w:p>
+      <w:r>
+        <w:t>Il lavoro è stato di gruppo: ognuno ha contribuito con le proprie competenze, collaborando e confrontandosi. Il sito è ancora in fase di sviluppo, ma include già diversi borghi e potrà essere ampliato in futuro.</w:t>
+      </w:r>
+    </w:p>
+    <w:p/>
+    <w:p>
+      <w:r>
+        <w:t>Questo progetto mi ha permesso di unire competenze digitali, creatività ed educazione civica, facendomi capire quanto sia importante promuovere il territorio con passione e rigore.</w:t>
+      </w:r>
+      <w:r>
+        <w:br/>
+      </w:r>
+      <w:r>
+        <w:br/>
+      </w:r>
+      <w:r>
+        <w:br/>
       </w:r>
       <w:r>
         <w:rPr>
           <w:b/>
           <w:bCs/>
         </w:rPr>
-        <w:t xml:space="preserve"> Mini discorso – Progetto Marketing Territoriale</w:t>
-      </w:r>
-    </w:p>
-    <w:p>
+        <w:t>VERSIONE INTEGRALE:</w:t>
+      </w:r>
+      <w:r>
+        <w:br/>
+      </w:r>
       <w:r>
         <w:t>Buongiorno a tutti.</w:t>
-      </w:r>
-      <w:r>
-        <w:br/>
-        <w:t>Oggi vi presento il progetto di </w:t>
-      </w:r>
-      <w:r>
-        <w:rPr>
-          <w:b/>
-          <w:bCs/>
-        </w:rPr>
-        <w:t>marketing territoriale</w:t>
-      </w:r>
-      <w:r>
-        <w:t> che stiamo realizzando nell’ambito del nostro percorso scolastico, con l’obiettivo di valorizzare i borghi e le bellezze della Locride attraverso un sito web.</w:t>
-      </w:r>
-    </w:p>
-    <w:p>
-      <w:r>
-        <w:pict w14:anchorId="523B1FB6">
-          <v:rect id="_x0000_i1061" style="width:0;height:.75pt" o:hralign="center" o:hrstd="t" o:hr="t" fillcolor="#a0a0a0" stroked="f"/>
-        </w:pict>
-      </w:r>
-    </w:p>
-    <w:p>
-      <w:pPr>
-        <w:rPr>
-          <w:b/>
-          <w:bCs/>
-        </w:rPr>
-      </w:pPr>
-      <w:r>
-        <w:rPr>
-          <w:b/>
-          <w:bCs/>
-        </w:rPr>
-        <w:t>1. Cos’è il progetto?</w:t>
-      </w:r>
-    </w:p>
-    <w:p>
-      <w:r>
-        <w:t>Il progetto nasce dalla volontà di farci diventare non solo studenti, ma anche </w:t>
-      </w:r>
-      <w:r>
-        <w:rPr>
-          <w:b/>
-          <w:bCs/>
-        </w:rPr>
-        <w:t>protagonisti attivi nella promozione del nostro territorio</w:t>
-      </w:r>
-      <w:r>
-        <w:t>.</w:t>
-      </w:r>
-      <w:r>
-        <w:br/>
-        <w:t>L’idea è quella di utilizzare gli strumenti del marketing territoriale – come lo storytelling, la comunicazione visiva e la creazione di un’identità riconoscibile – per raccontare in modo nuovo i luoghi che ci circondano.</w:t>
-      </w:r>
-      <w:r>
-        <w:br/>
-        <w:t>Abbiamo scelto di farlo costruendo un </w:t>
-      </w:r>
-      <w:r>
-        <w:rPr>
-          <w:b/>
-          <w:bCs/>
-        </w:rPr>
-        <w:t>sito web</w:t>
-      </w:r>
-      <w:r>
-        <w:t> dedicato ai borghi storici della Locride, perché riteniamo che il digitale sia oggi il mezzo più efficace per far conoscere un territorio e per trasformarlo in un’esperienza da vivere.</w:t>
-      </w:r>
-    </w:p>
-    <w:p>
-      <w:r>
-        <w:pict w14:anchorId="413C7C48">
-          <v:rect id="_x0000_i1062" style="width:0;height:.75pt" o:hralign="center" o:hrstd="t" o:hr="t" fillcolor="#a0a0a0" stroked="f"/>
-        </w:pict>
-      </w:r>
-    </w:p>
-    <w:p>
-      <w:pPr>
-        <w:rPr>
-          <w:b/>
-          <w:bCs/>
-        </w:rPr>
-      </w:pPr>
-      <w:r>
-        <w:rPr>
-          <w:b/>
-          <w:bCs/>
-        </w:rPr>
-        <w:t>2. Come funziona il sito?</w:t>
-      </w:r>
-    </w:p>
-    <w:p>
-      <w:r>
-        <w:t>Il sito è strutturato in </w:t>
-      </w:r>
-      <w:r>
-        <w:rPr>
-          <w:b/>
-          <w:bCs/>
-        </w:rPr>
-        <w:t>schede descrittive</w:t>
-      </w:r>
-      <w:r>
-        <w:t>, una per ogni borgo.</w:t>
-      </w:r>
-      <w:r>
-        <w:br/>
-        <w:t>Ogni scheda segue un </w:t>
-      </w:r>
-      <w:r>
-        <w:rPr>
-          <w:b/>
-          <w:bCs/>
-        </w:rPr>
-        <w:t>modello uniforme</w:t>
-      </w:r>
-      <w:r>
-        <w:t> che abbiamo studiato per garantire coerenza e facilità di navigazione:</w:t>
-      </w:r>
-    </w:p>
-    <w:p>
-      <w:pPr>
-        <w:numPr>
-          <w:ilvl w:val="0"/>
-          <w:numId w:val="1"/>
-        </w:numPr>
-      </w:pPr>
-      <w:r>
-        <w:t>una </w:t>
-      </w:r>
-      <w:proofErr w:type="spellStart"/>
-      <w:r>
-        <w:rPr>
-          <w:b/>
-          <w:bCs/>
-        </w:rPr>
-        <w:t>hero</w:t>
-      </w:r>
-      <w:proofErr w:type="spellEnd"/>
-      <w:r>
-        <w:rPr>
-          <w:b/>
-          <w:bCs/>
-        </w:rPr>
-        <w:t xml:space="preserve"> </w:t>
-      </w:r>
-      <w:proofErr w:type="spellStart"/>
-      <w:r>
-        <w:rPr>
-          <w:b/>
-          <w:bCs/>
-        </w:rPr>
-        <w:t>section</w:t>
-      </w:r>
-      <w:proofErr w:type="spellEnd"/>
-      <w:r>
-        <w:t> con un’immagine panoramica e una frase evocativa;</w:t>
-      </w:r>
-    </w:p>
-    <w:p>
-      <w:pPr>
-        <w:numPr>
-          <w:ilvl w:val="0"/>
-          <w:numId w:val="1"/>
-        </w:numPr>
-      </w:pPr>
-      <w:r>
-        <w:t>delle </w:t>
-      </w:r>
-      <w:r>
-        <w:rPr>
-          <w:b/>
-          <w:bCs/>
-        </w:rPr>
-        <w:t>info cards</w:t>
-      </w:r>
-      <w:r>
-        <w:t> con i dati essenziali (altitudine, popolazione, patrono, eventi);</w:t>
-      </w:r>
-    </w:p>
-    <w:p>
-      <w:pPr>
-        <w:numPr>
-          <w:ilvl w:val="0"/>
-          <w:numId w:val="1"/>
-        </w:numPr>
-      </w:pPr>
-      <w:r>
-        <w:t>sezioni descrittive composte da </w:t>
-      </w:r>
-      <w:r>
-        <w:rPr>
-          <w:b/>
-          <w:bCs/>
-        </w:rPr>
-        <w:t>due blocchi alternati</w:t>
-      </w:r>
-      <w:r>
-        <w:t> (testo a sinistra e immagine a destra, poi il contrario), per raccontare storia, arte, tradizioni e natura in modo equilibrato;</w:t>
-      </w:r>
-    </w:p>
-    <w:p>
-      <w:pPr>
-        <w:numPr>
-          <w:ilvl w:val="0"/>
-          <w:numId w:val="1"/>
-        </w:numPr>
-      </w:pPr>
-      <w:r>
-        <w:t>una </w:t>
-      </w:r>
-      <w:r>
-        <w:rPr>
-          <w:b/>
-          <w:bCs/>
-        </w:rPr>
-        <w:t>galleria fotografica</w:t>
-      </w:r>
-      <w:r>
-        <w:t> per mostrare i luoghi più suggestivi;</w:t>
-      </w:r>
-    </w:p>
-    <w:p>
-      <w:pPr>
-        <w:numPr>
-          <w:ilvl w:val="0"/>
-          <w:numId w:val="1"/>
-        </w:numPr>
-      </w:pPr>
-      <w:r>
-        <w:t>una sezione con </w:t>
-      </w:r>
-      <w:r>
-        <w:rPr>
-          <w:b/>
-          <w:bCs/>
-        </w:rPr>
-        <w:t>info utili</w:t>
-      </w:r>
-      <w:r>
-        <w:t> per chi volesse visitare il borgo (come arrivare, contatti, trasporti).</w:t>
-      </w:r>
-    </w:p>
-    <w:p>
-      <w:r>
-        <w:t>Inoltre, abbiamo dedicato spazio alle </w:t>
-      </w:r>
-      <w:r>
-        <w:rPr>
-          <w:b/>
-          <w:bCs/>
-        </w:rPr>
-        <w:t>tradizioni e alla cultura</w:t>
-      </w:r>
-      <w:r>
-        <w:t> attraverso delle card che raccolgono curiosità, eventi, prodotti tipici e artigianato locale.</w:t>
-      </w:r>
-    </w:p>
-    <w:p>
-      <w:r>
-        <w:pict w14:anchorId="4878B6F7">
-          <v:rect id="_x0000_i1063" style="width:0;height:.75pt" o:hralign="center" o:hrstd="t" o:hr="t" fillcolor="#a0a0a0" stroked="f"/>
-        </w:pict>
-      </w:r>
-    </w:p>
-    <w:p>
-      <w:pPr>
-        <w:rPr>
-          <w:b/>
-          <w:bCs/>
-        </w:rPr>
-      </w:pPr>
-      <w:r>
-        <w:rPr>
-          <w:b/>
-          <w:bCs/>
-        </w:rPr>
-        <w:t>3. Come lo abbiamo costruito?</w:t>
-      </w:r>
-    </w:p>
-    <w:p>
-      <w:r>
-        <w:t>Abbiamo iniziato con una </w:t>
-      </w:r>
-      <w:r>
-        <w:rPr>
-          <w:b/>
-          <w:bCs/>
-        </w:rPr>
-        <w:t>ricerca accurata</w:t>
-      </w:r>
-      <w:r>
-        <w:t> delle informazioni storiche e culturali, verificando ogni dato per garantire l’attendibilità dei contenuti.</w:t>
-      </w:r>
-      <w:r>
-        <w:br/>
-      </w:r>
-      <w:r>
-        <w:lastRenderedPageBreak/>
-        <w:t>Poi abbiamo sviluppato un </w:t>
-      </w:r>
-      <w:r>
-        <w:rPr>
-          <w:b/>
-          <w:bCs/>
-        </w:rPr>
-        <w:t>template HTML/CSS responsive</w:t>
-      </w:r>
-      <w:r>
-        <w:t>, che ci permette di uniformare lo stile e di concentrarci sui contenuti.</w:t>
-      </w:r>
-      <w:r>
-        <w:br/>
-        <w:t>Abbiamo scelto una </w:t>
-      </w:r>
-      <w:r>
-        <w:rPr>
-          <w:b/>
-          <w:bCs/>
-        </w:rPr>
-        <w:t>paletta di colori elegante</w:t>
-      </w:r>
-      <w:r>
-        <w:t> e un font chiaro, per rendere la lettura piacevole.</w:t>
-      </w:r>
-      <w:r>
-        <w:br/>
-        <w:t xml:space="preserve">Le immagini sono state ottimizzate in formato </w:t>
-      </w:r>
-      <w:proofErr w:type="spellStart"/>
-      <w:r>
-        <w:t>WebP</w:t>
-      </w:r>
-      <w:proofErr w:type="spellEnd"/>
-      <w:r>
-        <w:t xml:space="preserve"> per garantire tempi di caricamento rapidi, e ogni foto è stata scelta per raccontare un aspetto specifico del borgo.</w:t>
-      </w:r>
-    </w:p>
-    <w:p>
-      <w:r>
-        <w:t>Il lavoro è stato svolto in gruppo, ma ognuno di noi ha contribuito alla </w:t>
-      </w:r>
-      <w:r>
-        <w:rPr>
-          <w:b/>
-          <w:bCs/>
-        </w:rPr>
-        <w:t>ricerca, alla scrittura dei testi, alla selezione delle immagini e alla codifica</w:t>
-      </w:r>
-      <w:r>
-        <w:t>.</w:t>
-      </w:r>
-      <w:r>
-        <w:br/>
-        <w:t>È stato fondamentale confrontarci con le fonti, evitare errori e costruire un racconto che fosse allo stesso tempo </w:t>
-      </w:r>
-      <w:r>
-        <w:rPr>
-          <w:b/>
-          <w:bCs/>
-        </w:rPr>
-        <w:t>emozionante e corretto</w:t>
-      </w:r>
-      <w:r>
-        <w:t>.</w:t>
-      </w:r>
-    </w:p>
-    <w:p>
-      <w:r>
-        <w:pict w14:anchorId="5A0FEF48">
-          <v:rect id="_x0000_i1064" style="width:0;height:.75pt" o:hralign="center" o:hrstd="t" o:hr="t" fillcolor="#a0a0a0" stroked="f"/>
-        </w:pict>
-      </w:r>
-    </w:p>
-    <w:p>
-      <w:pPr>
-        <w:rPr>
-          <w:b/>
-          <w:bCs/>
-        </w:rPr>
-      </w:pPr>
-      <w:r>
-        <w:rPr>
-          <w:b/>
-          <w:bCs/>
-        </w:rPr>
-        <w:t>4. Qual è l’obiettivo?</w:t>
-      </w:r>
-    </w:p>
-    <w:p>
-      <w:r>
-        <w:t>Il nostro obiettivo è duplice:</w:t>
-      </w:r>
-      <w:r>
-        <w:br/>
-        <w:t>da un lato, vogliamo </w:t>
-      </w:r>
-      <w:r>
-        <w:rPr>
-          <w:b/>
-          <w:bCs/>
-        </w:rPr>
-        <w:t>promuovere il territorio</w:t>
-      </w:r>
-      <w:r>
-        <w:t> e offrire una </w:t>
-      </w:r>
-      <w:r>
-        <w:rPr>
-          <w:b/>
-          <w:bCs/>
-        </w:rPr>
-        <w:t>vetrina digitale</w:t>
-      </w:r>
-      <w:r>
-        <w:t> accessibile a tutti, che possa diventare uno strumento utile per chi vuole scoprire i nostri borghi;</w:t>
-      </w:r>
-      <w:r>
-        <w:br/>
-        <w:t>dall’altro, vogliamo dimostrare come il </w:t>
-      </w:r>
-      <w:r>
-        <w:rPr>
-          <w:b/>
-          <w:bCs/>
-        </w:rPr>
-        <w:t>marketing territoriale</w:t>
-      </w:r>
-      <w:r>
-        <w:t> possa essere applicato in modo creativo, valorizzando il patrimonio culturale e rafforzando l’identità locale.</w:t>
-      </w:r>
-      <w:r>
-        <w:br/>
-        <w:t>Il sito non vuole essere solo un elenco di luoghi, ma un </w:t>
-      </w:r>
-      <w:r>
-        <w:rPr>
-          <w:b/>
-          <w:bCs/>
-        </w:rPr>
-        <w:t>invito a visitarli</w:t>
-      </w:r>
-      <w:r>
-        <w:t>, a conoscerne le storie, a viverli.</w:t>
-      </w:r>
-    </w:p>
-    <w:p>
-      <w:r>
-        <w:pict w14:anchorId="305B76EC">
-          <v:rect id="_x0000_i1065" style="width:0;height:.75pt" o:hralign="center" o:hrstd="t" o:hr="t" fillcolor="#a0a0a0" stroked="f"/>
-        </w:pict>
-      </w:r>
-    </w:p>
-    <w:p>
-      <w:pPr>
-        <w:rPr>
-          <w:b/>
-          <w:bCs/>
-        </w:rPr>
-      </w:pPr>
-      <w:r>
-        <w:rPr>
-          <w:b/>
-          <w:bCs/>
-        </w:rPr>
-        <w:t>5. Stato attuale dei lavori</w:t>
-      </w:r>
-    </w:p>
-    <w:p>
-      <w:r>
-        <w:t>Il sito non è ancora completo al 100%: abbiamo già realizzato le pagine di molti borghi (come Caulonia, Locri, Ciminà, Platì, Riace, Roccella, Sant’Agata del Bianco, Siderno, Stilo, Brancaleone, San Luca, Samo), ma stiamo ancora lavorando per aggiungerne altri e per perfezionare alcuni dettagli grafici e testuali.</w:t>
-      </w:r>
-      <w:r>
-        <w:br/>
-        <w:t>L’idea è che il progetto continui a crescere, e in futuro potrebbe arricchirsi anche con percorsi tematici, video e contenuti multimediali.</w:t>
-      </w:r>
-    </w:p>
-    <w:p>
-      <w:r>
-        <w:pict w14:anchorId="3FEE0670">
-          <v:rect id="_x0000_i1066" style="width:0;height:.75pt" o:hralign="center" o:hrstd="t" o:hr="t" fillcolor="#a0a0a0" stroked="f"/>
-        </w:pict>
-      </w:r>
-    </w:p>
-    <w:p>
-      <w:pPr>
-        <w:rPr>
-          <w:b/>
-          <w:bCs/>
-        </w:rPr>
-      </w:pPr>
-      <w:r>
-        <w:rPr>
-          <w:b/>
-          <w:bCs/>
-        </w:rPr>
-        <w:t>6. Conclusione</w:t>
-      </w:r>
-    </w:p>
-    <w:p>
-      <w:r>
-        <w:t>In sintesi, questo progetto ci ha permesso di unire </w:t>
-      </w:r>
-      <w:r>
-        <w:rPr>
-          <w:b/>
-          <w:bCs/>
-        </w:rPr>
-        <w:t>competenze digitali</w:t>
-      </w:r>
-      <w:r>
-        <w:t>, </w:t>
-      </w:r>
-      <w:r>
-        <w:rPr>
-          <w:b/>
-          <w:bCs/>
-        </w:rPr>
-        <w:t>educazione civica</w:t>
-      </w:r>
-      <w:r>
-        <w:t> e </w:t>
-      </w:r>
-      <w:r>
-        <w:rPr>
-          <w:b/>
-          <w:bCs/>
-        </w:rPr>
-        <w:t>creatività</w:t>
-      </w:r>
-      <w:r>
-        <w:t>, facendoci sentire parte attiva della comunità.</w:t>
-      </w:r>
-      <w:r>
-        <w:br/>
-        <w:t>Abbiamo imparato che promuovere un territorio significa raccontarlo con passione e con rigore, perché ogni borgo ha una storia da condividere e merita di essere conosciuto.</w:t>
-      </w:r>
-    </w:p>
-    <w:p>
-      <w:r>
-        <w:t>Grazie per l’attenzione. Sono a disposizione per eventuali domande.</w:t>
       </w:r>
     </w:p>
     <w:p/>
+    <w:p>
+      <w:r>
+        <w:t>Oggi vi parlo del progetto di marketing territoriale che stiamo realizzando con la classe. In particolare, io ho seguito la parte di programmazione e costruzione del sito, quindi posso raccontarvi come è nato e come l’ho realizzato.</w:t>
+      </w:r>
+    </w:p>
+    <w:p/>
+    <w:p>
+      <w:r>
+        <w:t>L’idea è nata dalla voglia di non essere solo studenti che studiano il territorio, ma di diventare protagonisti attivi nella sua valorizzazione. Abbiamo scelto di usare gli strumenti del marketing territoriale – lo storytelling, la comunicazione visiva, la creazione di un’identità riconoscibile – per raccontare in modo nuovo i luoghi che ci circondano. E abbiamo deciso di farlo con un sito web dedicato ai borghi storici della Locride, perché oggi il digitale è il mezzo più efficace per far conoscere un posto e trasformarlo in un’esperienza da vivere.</w:t>
+      </w:r>
+    </w:p>
+    <w:p/>
+    <w:p>
+      <w:r>
+        <w:t xml:space="preserve">Io mi sono occupato della parte tecnica: ho costruito il sito partendo da zero. Ho scritto tutto il codice in HTML e CSS, senza usare framework pesanti, perché volevo avere il controllo completo di ogni dettaglio. Ho scelto una paletta di colori elegante e un font chiaro, pensando alla leggibilità. Per la mappa interattiva ho usato </w:t>
+      </w:r>
+      <w:proofErr w:type="spellStart"/>
+      <w:r>
+        <w:t>Leaflet</w:t>
+      </w:r>
+      <w:proofErr w:type="spellEnd"/>
+      <w:r>
+        <w:t xml:space="preserve">, una libreria JavaScript leggera che mi ha permesso di inserire marker cliccabili per ogni borgo. Le icone sono di </w:t>
+      </w:r>
+      <w:proofErr w:type="spellStart"/>
+      <w:r>
+        <w:t>FontAwesome</w:t>
+      </w:r>
+      <w:proofErr w:type="spellEnd"/>
+      <w:r>
+        <w:t xml:space="preserve">, i font </w:t>
+      </w:r>
+      <w:r>
+        <w:lastRenderedPageBreak/>
+        <w:t>li ho presi da Google Fonts. Ho lavorato su Visual Studio Code, un editor che mi ha aiutato a tenere tutto organizzato, e ho messo il codice su GitHub per gestire le versioni e collaborare con i miei compagni. Alla fine, ho pubblicato l’anteprima su GitHub Pages, così da poterla condividere e ricevere feedback.</w:t>
+      </w:r>
+    </w:p>
+    <w:p/>
+    <w:p>
+      <w:r>
+        <w:t>Ma prima ancora di scrivere una riga di codice, abbiamo fatto un lavoro di ricerca molto accurato. Io e i miei compagni abbiamo cercato le informazioni storiche e culturali, incrociando più fonti, verificando ogni dato. Ci tenevamo che tutto fosse vero, perché raccontare un posto significa anche avere il dovere di non sbagliare.</w:t>
+      </w:r>
+    </w:p>
+    <w:p/>
+    <w:p>
+      <w:r>
+        <w:t xml:space="preserve">Poi ho sviluppato un template che potesse essere replicato per ogni borgo: una </w:t>
+      </w:r>
+      <w:proofErr w:type="spellStart"/>
+      <w:r>
+        <w:t>hero</w:t>
+      </w:r>
+      <w:proofErr w:type="spellEnd"/>
+      <w:r>
+        <w:t xml:space="preserve"> </w:t>
+      </w:r>
+      <w:proofErr w:type="spellStart"/>
+      <w:r>
+        <w:t>section</w:t>
+      </w:r>
+      <w:proofErr w:type="spellEnd"/>
+      <w:r>
+        <w:t xml:space="preserve"> con un’immagine panoramica e una frase evocativa, delle info cards con i dati essenziali, sezioni descrittive con due blocchi alternati – testo a sinistra e immagine a destra, poi il contrario – per raccontare storia, arte, tradizioni e natura in modo equilibrato. Poi una galleria fotografica e infine una sezione con info utili per chi volesse visitare davvero il borgo. Abbiamo anche dedicato spazio alle tradizioni e alla cultura con delle card che raccolgono curiosità, eventi, prodotti tipici e artigianato locale.</w:t>
+      </w:r>
+    </w:p>
+    <w:p/>
+    <w:p>
+      <w:r>
+        <w:t xml:space="preserve">Le immagini le ho ottimizzate per il web: le ho convertite in </w:t>
+      </w:r>
+      <w:proofErr w:type="spellStart"/>
+      <w:r>
+        <w:t>WebP</w:t>
+      </w:r>
+      <w:proofErr w:type="spellEnd"/>
+      <w:r>
+        <w:t>, un formato moderno che pesa molto meno senza perdere qualità, e le ho ridimensionate a dimensioni adatte per non rallentare il caricamento. Alcune foto le avevamo, altre le abbiamo richieste a enti locali come le Pro Loco, che ci hanno aiutato volentieri.</w:t>
+      </w:r>
+    </w:p>
+    <w:p/>
+    <w:p>
+      <w:r>
+        <w:t>Il lavoro è stato fatto in gruppo: ognuno di noi ha messo le mani in pasta. Chi ha cercato le fonti, chi ha scritto i testi, chi ha scelto le immagini. Io mi sono concentrato sulla programmazione, ma ci siamo confrontati tanto, abbiamo fatto riunioni per allinearci. È stato un bel lavoro di squadra, e ho imparato che per raccontare un territorio bisogna essere rigorosi, ma anche appassionati.</w:t>
+      </w:r>
+    </w:p>
+    <w:p/>
+    <w:p>
+      <w:r>
+        <w:t>Il sito non è ancora completo al 100%: mancano alcuni borghi e ci sono ancora dettagli grafici e testuali da perfezionare. Per ora abbiamo realizzato le pagine di Caulonia, Locri, Ciminà, Platì, Riace, Roccella, Sant’Agata del Bianco, Siderno, Stilo, Brancaleone, San Luca e Samo. Sto lavorando per aggiungerne altri e per migliorare alcuni aspetti. L’idea è che questo progetto continui a crescere: in futuro potrebbe arricchirsi con percorsi tematici, video, contenuti multimediali…</w:t>
+      </w:r>
+    </w:p>
+    <w:p/>
+    <w:p>
+      <w:r>
+        <w:lastRenderedPageBreak/>
+        <w:t>L’obiettivo, in fondo, è duplice. Da un lato vogliamo promuovere il territorio e offrire una vetrina digitale accessibile a tutti – uno strumento utile per chi vuole scoprire i nostri borghi. Dall’altro vogliamo dimostrare che il marketing territoriale non è solo teoria: può essere applicato in modo creativo, valorizzando il patrimonio culturale e rafforzando l’identità locale. Il sito non è un semplice elenco, ma un invito a visitare, a conoscere le storie, a vivere questi luoghi.</w:t>
+      </w:r>
+    </w:p>
+    <w:p/>
+    <w:p>
+      <w:r>
+        <w:t>In sintesi, questo progetto mi ha permesso di unire competenze digitali, educazione civica e creatività, facendomi sentire parte attiva della comunità. Ho capito che promuovere un territorio significa raccontarlo con passione e con rigore, perché ogni borgo ha una storia che merita di essere condivisa.</w:t>
+      </w:r>
+    </w:p>
+    <w:p/>
+    <w:p>
+      <w:r>
+        <w:t>Grazie per l’attenzione. Se avete domande, sono qui.</w:t>
+      </w:r>
+    </w:p>
     <w:sectPr>
       <w:pgSz w:w="11906" w:h="16838"/>
       <w:pgMar w:top="1417" w:right="1134" w:bottom="1134" w:left="1134" w:header="708" w:footer="708" w:gutter="0"/>
@@ -1344,6 +938,7 @@
   <w:style w:type="character" w:default="1" w:styleId="Carpredefinitoparagrafo">
     <w:name w:val="Default Paragraph Font"/>
     <w:uiPriority w:val="1"/>
+    <w:semiHidden/>
     <w:unhideWhenUsed/>
   </w:style>
   <w:style w:type="table" w:default="1" w:styleId="Tabellanormale">

</xml_diff>